<commit_message>
Update tura2 report: add amber notes section at bottom
</commit_message>
<xml_diff>
--- a/raport-test-ab-tura2.docx
+++ b/raport-test-ab-tura2.docx
@@ -4,20 +4,21 @@
   <w:body>
     <w:p>
       <w:pPr>
-        <w:spacing w:after="40"/>
+        <w:spacing w:after="40" w:before="0"/>
       </w:pPr>
       <w:r>
         <w:rPr>
           <w:b/>
+          <w:i w:val="0"/>
           <w:color w:val="1A3A2A"/>
           <w:sz w:val="40"/>
         </w:rPr>
-        <w:t>Test kreacji — tura 2: wynik i rekomendacja</w:t>
+        <w:t>Test kreacji — tura 2</w:t>
       </w:r>
     </w:p>
     <w:p>
       <w:pPr>
-        <w:spacing w:after="80"/>
+        <w:spacing w:after="40" w:before="0"/>
       </w:pPr>
       <w:r>
         <w:rPr>
@@ -31,7 +32,7 @@
     </w:p>
     <w:p>
       <w:pPr>
-        <w:spacing w:after="280"/>
+        <w:spacing w:after="320" w:before="0"/>
       </w:pPr>
       <w:r>
         <w:rPr>
@@ -43,52 +44,45 @@
         <w:t>Budzet: ~600 PLN / wariant  ·  Cel: Sprzedaz  ·  Odbiorcy: Zainteresowania</w:t>
       </w:r>
     </w:p>
-    <w:tbl>
-      <w:tblPr>
-        <w:tblStyle w:val="TableGrid"/>
-        <w:tblW w:type="auto" w:w="0"/>
-        <w:tblLook w:firstColumn="1" w:firstRow="1" w:lastColumn="0" w:lastRow="0" w:noHBand="0" w:noVBand="1" w:val="04A0"/>
-      </w:tblPr>
-      <w:tblGrid>
-        <w:gridCol w:w="9406"/>
-      </w:tblGrid>
-      <w:tr>
-        <w:tc>
-          <w:tcPr>
-            <w:tcW w:type="dxa" w:w="9406"/>
-            <w:shd w:fill="FFF9C3" w:val="clear"/>
-          </w:tcPr>
-          <w:p>
-            <w:r>
-              <w:rPr>
-                <w:b/>
-                <w:sz w:val="20"/>
-              </w:rPr>
-              <w:t>Dlaczego robimy ture 2?</w:t>
-              <w:br/>
-            </w:r>
-            <w:r>
-              <w:rPr>
-                <w:sz w:val="20"/>
-              </w:rPr>
-              <w:t>Tura 1 (maj 2026) zakonczyla sie remisem na CPA (30,65 vs 30,69 PLN) przy malej skali (13 zakupow na wariant). Wyniki byly kierunkowe, nie pewne. Ewa Holek-Krzysztof zaproponowala powtorzenie testu z budzetem 600 PLN / wariant, by osiagnac 20+ zakupow i wiarygodny wynik.</w:t>
-            </w:r>
-          </w:p>
-        </w:tc>
-      </w:tr>
-    </w:tbl>
-    <w:p/>
     <w:p>
       <w:pPr>
-        <w:spacing w:before="120" w:after="120"/>
+        <w:spacing w:after="80" w:before="0"/>
       </w:pPr>
       <w:r>
         <w:rPr>
           <w:b/>
-          <w:color w:val="2D6A4F"/>
-          <w:sz w:val="18"/>
+          <w:i w:val="0"/>
+          <w:color w:val="1A3A2A"/>
+          <w:sz w:val="22"/>
         </w:rPr>
-        <w:t>WYNIKI TURY 2</w:t>
+        <w:t>Dlaczego tura 2?</w:t>
+      </w:r>
+    </w:p>
+    <w:p>
+      <w:pPr>
+        <w:spacing w:after="280" w:before="0"/>
+      </w:pPr>
+      <w:r>
+        <w:rPr>
+          <w:b w:val="0"/>
+          <w:i w:val="0"/>
+          <w:sz w:val="20"/>
+        </w:rPr>
+        <w:t>Tura 1 (maj 2026) zakonczyla sie remisem na CPA (30,65 vs 30,69 PLN) przy 13 zakupach na wariant — zbyt mala skala by wyciagnac wnioski. Na prosbę Ewy Holek-Krzysztof powtorzylismy test z budzetem 600 PLN / wariant i minimalnym czasem 17 dni.</w:t>
+      </w:r>
+    </w:p>
+    <w:p>
+      <w:pPr>
+        <w:spacing w:after="120" w:before="0"/>
+      </w:pPr>
+      <w:r>
+        <w:rPr>
+          <w:b/>
+          <w:i w:val="0"/>
+          <w:color w:val="1A3A2A"/>
+          <w:sz w:val="22"/>
+        </w:rPr>
+        <w:t>Wyniki tury 2</w:t>
       </w:r>
     </w:p>
     <w:tbl>
@@ -132,7 +126,7 @@
                 <w:color w:val="FFFFFF"/>
                 <w:sz w:val="20"/>
               </w:rPr>
-              <w:t>🌿 Plener</w:t>
+              <w:t>Plener</w:t>
             </w:r>
           </w:p>
         </w:tc>
@@ -148,7 +142,7 @@
                 <w:color w:val="FFFFFF"/>
                 <w:sz w:val="20"/>
               </w:rPr>
-              <w:t>🎬 Studio (lacznie)</w:t>
+              <w:t>Studio (lacznie)</w:t>
             </w:r>
           </w:p>
         </w:tc>
@@ -164,7 +158,7 @@
                 <w:color w:val="FFFFFF"/>
                 <w:sz w:val="20"/>
               </w:rPr>
-              <w:t>Lepszy wynik</w:t>
+              <w:t>Lepszy</w:t>
             </w:r>
           </w:p>
         </w:tc>
@@ -259,9 +253,10 @@
           <w:p>
             <w:r>
               <w:rPr>
+                <w:color w:val="C0392B"/>
                 <w:sz w:val="20"/>
               </w:rPr>
-              <w:t>∲48 900</w:t>
+              <w:t>~48 900</w:t>
             </w:r>
           </w:p>
         </w:tc>
@@ -274,7 +269,7 @@
               <w:rPr>
                 <w:sz w:val="20"/>
               </w:rPr>
-              <w:t>🌿 Plener</w:t>
+              <w:t>Plener</w:t>
             </w:r>
           </w:p>
         </w:tc>
@@ -315,6 +310,7 @@
           <w:p>
             <w:r>
               <w:rPr>
+                <w:color w:val="C0392B"/>
                 <w:sz w:val="20"/>
               </w:rPr>
               <w:t>8,23–9,77</w:t>
@@ -330,7 +326,7 @@
               <w:rPr>
                 <w:sz w:val="20"/>
               </w:rPr>
-              <w:t>🌿 Plener</w:t>
+              <w:t>Plener</w:t>
             </w:r>
           </w:p>
         </w:tc>
@@ -371,6 +367,7 @@
           <w:p>
             <w:r>
               <w:rPr>
+                <w:color w:val="C0392B"/>
                 <w:sz w:val="20"/>
               </w:rPr>
               <w:t>0,75–0,86%</w:t>
@@ -386,7 +383,7 @@
               <w:rPr>
                 <w:sz w:val="20"/>
               </w:rPr>
-              <w:t>🌿 Plener</w:t>
+              <w:t>Plener</w:t>
             </w:r>
           </w:p>
         </w:tc>
@@ -427,6 +424,7 @@
           <w:p>
             <w:r>
               <w:rPr>
+                <w:color w:val="C0392B"/>
                 <w:sz w:val="20"/>
               </w:rPr>
               <w:t>1,09–1,13</w:t>
@@ -442,7 +440,7 @@
               <w:rPr>
                 <w:sz w:val="20"/>
               </w:rPr>
-              <w:t>🌿 Plener</w:t>
+              <w:t>Plener</w:t>
             </w:r>
           </w:p>
         </w:tc>
@@ -483,6 +481,7 @@
           <w:p>
             <w:r>
               <w:rPr>
+                <w:color w:val="C0392B"/>
                 <w:sz w:val="20"/>
               </w:rPr>
               <w:t>13</w:t>
@@ -498,7 +497,7 @@
               <w:rPr>
                 <w:sz w:val="20"/>
               </w:rPr>
-              <w:t>🌿 Plener</w:t>
+              <w:t>Plener</w:t>
             </w:r>
           </w:p>
         </w:tc>
@@ -515,7 +514,7 @@
                 <w:b/>
                 <w:sz w:val="20"/>
               </w:rPr>
-              <w:t>⭐ CPA (PLN)</w:t>
+              <w:t>CPA (PLN) ⭐</w:t>
             </w:r>
           </w:p>
         </w:tc>
@@ -547,7 +546,7 @@
                 <w:color w:val="C0392B"/>
                 <w:sz w:val="20"/>
               </w:rPr>
-              <w:t>∲46,00</w:t>
+              <w:t>~46,00</w:t>
             </w:r>
           </w:p>
         </w:tc>
@@ -562,7 +561,7 @@
                 <w:b/>
                 <w:sz w:val="20"/>
               </w:rPr>
-              <w:t>🌿 Plener</w:t>
+              <w:t>Plener</w:t>
             </w:r>
           </w:p>
         </w:tc>
@@ -592,7 +591,7 @@
                 <w:color w:val="2D6A4F"/>
                 <w:sz w:val="20"/>
               </w:rPr>
-              <w:t>Powyzej sredniej</w:t>
+              <w:t>Powyzej sr.</w:t>
             </w:r>
           </w:p>
         </w:tc>
@@ -603,6 +602,7 @@
           <w:p>
             <w:r>
               <w:rPr>
+                <w:color w:val="C0392B"/>
                 <w:sz w:val="20"/>
               </w:rPr>
               <w:t>—</w:t>
@@ -618,7 +618,7 @@
               <w:rPr>
                 <w:sz w:val="20"/>
               </w:rPr>
-              <w:t>🌿 Plener</w:t>
+              <w:t>Plener</w:t>
             </w:r>
           </w:p>
         </w:tc>
@@ -627,15 +627,16 @@
     <w:p/>
     <w:p>
       <w:pPr>
-        <w:spacing w:after="120"/>
+        <w:spacing w:after="120" w:before="0"/>
       </w:pPr>
       <w:r>
         <w:rPr>
           <w:b/>
-          <w:color w:val="2D6A4F"/>
-          <w:sz w:val="18"/>
+          <w:i w:val="0"/>
+          <w:color w:val="1A3A2A"/>
+          <w:sz w:val="22"/>
         </w:rPr>
-        <w:t>POROWNANIE OBU TUR</w:t>
+        <w:t>Porownanie obu tur</w:t>
       </w:r>
     </w:p>
     <w:tbl>
@@ -677,7 +678,7 @@
                 <w:color w:val="FFFFFF"/>
                 <w:sz w:val="20"/>
               </w:rPr>
-              <w:t>🗓 Tura 1 (maj)</w:t>
+              <w:t>Tura 1 (maj)</w:t>
             </w:r>
           </w:p>
         </w:tc>
@@ -693,7 +694,7 @@
                 <w:color w:val="FFFFFF"/>
                 <w:sz w:val="20"/>
               </w:rPr>
-              <w:t>🗓 Tura 2 (lip–sie)</w:t>
+              <w:t>Tura 2 (lip–sie)</w:t>
             </w:r>
           </w:p>
         </w:tc>
@@ -890,7 +891,7 @@
               <w:rPr>
                 <w:sz w:val="20"/>
               </w:rPr>
-              <w:t>∲30,69 PLN</w:t>
+              <w:t>~30,69 PLN</w:t>
             </w:r>
           </w:p>
         </w:tc>
@@ -903,7 +904,7 @@
               <w:rPr>
                 <w:sz w:val="20"/>
               </w:rPr>
-              <w:t>∲46,00 PLN</w:t>
+              <w:t>~46,00 PLN</w:t>
             </w:r>
           </w:p>
         </w:tc>
@@ -936,7 +937,7 @@
                 <w:b/>
                 <w:sz w:val="20"/>
               </w:rPr>
-              <w:t>🤝 Remis</w:t>
+              <w:t>Remis</w:t>
             </w:r>
           </w:p>
         </w:tc>
@@ -951,43 +952,7 @@
                 <w:b/>
                 <w:sz w:val="20"/>
               </w:rPr>
-              <w:t>🌿 Plener wygrywa</w:t>
-            </w:r>
-          </w:p>
-        </w:tc>
-      </w:tr>
-    </w:tbl>
-    <w:p/>
-    <w:tbl>
-      <w:tblPr>
-        <w:tblStyle w:val="TableGrid"/>
-        <w:tblW w:type="auto" w:w="0"/>
-        <w:tblLook w:firstColumn="1" w:firstRow="1" w:lastColumn="0" w:lastRow="0" w:noHBand="0" w:noVBand="1" w:val="04A0"/>
-      </w:tblPr>
-      <w:tblGrid>
-        <w:gridCol w:w="9406"/>
-      </w:tblGrid>
-      <w:tr>
-        <w:tc>
-          <w:tcPr>
-            <w:tcW w:type="dxa" w:w="9406"/>
-            <w:shd w:fill="E5EFE9" w:val="clear"/>
-          </w:tcPr>
-          <w:p>
-            <w:r>
-              <w:rPr>
-                <w:b/>
-                <w:color w:val="1A3A2A"/>
-                <w:sz w:val="28"/>
-              </w:rPr>
-              <w:t>ZWYCIEZCA: Zdjecia plenerowe</w:t>
-              <w:br/>
-            </w:r>
-            <w:r>
-              <w:rPr>
-                <w:sz w:val="20"/>
-              </w:rPr>
-              <w:t>Przy rownym budzecie (~600 PLN / wariant) plener wygenerował 70% wiecej zakupow (22 vs 13) i CPA nizszy o 19 PLN (27,27 vs ~46 PLN). CPM plenerowy jest znacznie tanszy (5,75 vs ~9 PLN) — Meta faworyzuje te kreacje w aukcji. Ranking jakosci: powyzej sredniej. Wynik jednoznaczny.</w:t>
+              <w:t>Plener wygrywa</w:t>
             </w:r>
           </w:p>
         </w:tc>
@@ -996,15 +961,43 @@
     <w:p/>
     <w:p>
       <w:pPr>
-        <w:spacing w:after="120"/>
+        <w:spacing w:after="80" w:before="0"/>
       </w:pPr>
       <w:r>
         <w:rPr>
           <w:b/>
-          <w:color w:val="2D6A4F"/>
-          <w:sz w:val="18"/>
+          <w:i w:val="0"/>
+          <w:color w:val="1A3A2A"/>
+          <w:sz w:val="26"/>
         </w:rPr>
-        <w:t>REKOMENDACJE</w:t>
+        <w:t>Zwyciezca: Zdjecia plenerowe</w:t>
+      </w:r>
+    </w:p>
+    <w:p>
+      <w:pPr>
+        <w:spacing w:after="320" w:before="0"/>
+      </w:pPr>
+      <w:r>
+        <w:rPr>
+          <w:b w:val="0"/>
+          <w:i w:val="0"/>
+          <w:sz w:val="20"/>
+        </w:rPr>
+        <w:t>Przy rownym budzecie (~600 PLN / wariant) plener wygenerował 70% wiecej zakupow (22 vs 13) i CPA nizszy o 19 PLN (27,27 vs ~46 PLN). CPM plenerowy jest znacznie tanszy (5,75 vs ~9 PLN). Ranking jakosci: powyzej sredniej. Wynik jednoznaczny.</w:t>
+      </w:r>
+    </w:p>
+    <w:p>
+      <w:pPr>
+        <w:spacing w:after="120" w:before="0"/>
+      </w:pPr>
+      <w:r>
+        <w:rPr>
+          <w:b/>
+          <w:i w:val="0"/>
+          <w:color w:val="1A3A2A"/>
+          <w:sz w:val="22"/>
+        </w:rPr>
+        <w:t>Rekomendacje</w:t>
       </w:r>
     </w:p>
     <w:p>
@@ -1015,16 +1008,16 @@
         <w:rPr>
           <w:b/>
           <w:color w:val="1A3A2A"/>
-          <w:sz w:val="22"/>
+          <w:sz w:val="20"/>
         </w:rPr>
-        <w:t>🚀  Skaluj plener</w:t>
+        <w:t>Skaluj plener</w:t>
         <w:br/>
       </w:r>
       <w:r>
         <w:rPr>
           <w:sz w:val="20"/>
         </w:rPr>
-        <w:t>Plener zostaje jako glowna kreacja sprzedazowa. Mozna zwiekszyc budzet i przetestowac na lookalike 1-3%.</w:t>
+        <w:t>Plener zostaje jako glowna kreacja sprzedazowa. Mozna zwiekszyc budzet i przetestowac na lookalike 1–3%.</w:t>
       </w:r>
     </w:p>
     <w:p>
@@ -1035,16 +1028,16 @@
         <w:rPr>
           <w:b/>
           <w:color w:val="1A3A2A"/>
-          <w:sz w:val="22"/>
+          <w:sz w:val="20"/>
         </w:rPr>
-        <w:t>📦  Studio odloz</w:t>
+        <w:t>Studio odloz</w:t>
         <w:br/>
       </w:r>
       <w:r>
         <w:rPr>
           <w:sz w:val="20"/>
         </w:rPr>
-        <w:t>Studio nie uzasadnia dalszego testowania przy tym budzecie. Wysoki CPM i CPA wskazuja, ze Meta nie faworyzuje tej kreacji w aukcji.</w:t>
+        <w:t>Studio nie uzasadnia dalszego testowania. Wysoki CPM i CPA wskazuja, ze Meta nie faworyzuje tej kreacji w aukcji.</w:t>
       </w:r>
     </w:p>
     <w:p>
@@ -1055,22 +1048,112 @@
         <w:rPr>
           <w:b/>
           <w:color w:val="1A3A2A"/>
-          <w:sz w:val="22"/>
+          <w:sz w:val="20"/>
         </w:rPr>
-        <w:t>⏱  Czas testu: 14-17 dni minimum</w:t>
+        <w:t>Czas testu: 14–17 dni minimum</w:t>
         <w:br/>
       </w:r>
       <w:r>
         <w:rPr>
           <w:sz w:val="20"/>
         </w:rPr>
-        <w:t>17 dni przy 600 PLN / wariant pozwolilo zebrac 22 zakupy dla plenerowego — to wystarczajaca skala. Krotszy czas wrocilby do sytuacji z tury 1 (za malo danych).</w:t>
+        <w:t>17 dni przy 600 PLN / wariant pozwolilo zebrac 22 zakupy — wystarczajaca skala. Krotszy czas wrocilby do sytuacji z tury 1.</w:t>
       </w:r>
     </w:p>
     <w:p/>
     <w:p>
       <w:pPr>
-        <w:spacing w:after="80"/>
+        <w:spacing w:after="240"/>
+      </w:pPr>
+      <w:r>
+        <w:rPr>
+          <w:color w:val="5A6E64"/>
+          <w:sz w:val="18"/>
+        </w:rPr>
+        <w:t>────────────────────────────────────────────────────────────</w:t>
+      </w:r>
+    </w:p>
+    <w:p>
+      <w:pPr>
+        <w:spacing w:after="120" w:before="0"/>
+      </w:pPr>
+      <w:r>
+        <w:rPr>
+          <w:b/>
+          <w:i w:val="0"/>
+          <w:color w:val="B86A00"/>
+          <w:sz w:val="22"/>
+        </w:rPr>
+        <w:t>UWAGI</w:t>
+      </w:r>
+    </w:p>
+    <w:p>
+      <w:pPr>
+        <w:spacing w:after="160"/>
+        <w:ind w:left="283"/>
+      </w:pPr>
+      <w:r>
+        <w:rPr>
+          <w:b/>
+          <w:color w:val="B86A00"/>
+          <w:sz w:val="20"/>
+        </w:rPr>
+        <w:t xml:space="preserve">– </w:t>
+      </w:r>
+      <w:r>
+        <w:rPr>
+          <w:color w:val="B86A00"/>
+          <w:sz w:val="20"/>
+        </w:rPr>
+        <w:t>Studio w tym tescie bylo podzielone na dwa zestawy reklam z roznymi oknami atrybucji (klikniecia z 7 dni vs klikniecia z 7 dni lub wyswietlenia z 1 dnia). Lacznie wydano ~598 PLN i wygenerowano 13 zakupow. Dane sa spojne — nie ma rozjezdzania sie wynikow miedzy wariantami.</w:t>
+      </w:r>
+    </w:p>
+    <w:p>
+      <w:pPr>
+        <w:spacing w:after="160"/>
+        <w:ind w:left="283"/>
+      </w:pPr>
+      <w:r>
+        <w:rPr>
+          <w:b/>
+          <w:color w:val="B86A00"/>
+          <w:sz w:val="20"/>
+        </w:rPr>
+        <w:t xml:space="preserve">– </w:t>
+      </w:r>
+      <w:r>
+        <w:rPr>
+          <w:color w:val="B86A00"/>
+          <w:sz w:val="20"/>
+        </w:rPr>
+        <w:t>Wyniki studio moga byc czesciowo zaburzone przez wyzszy CPM — Meta faworyzuje w aukcji kreacje o wyzszym CTR i nizszym koszcie, co само w sobie jest sygnałem, ze algorytm "woli" plener. Nie jest to wina samego zdjecia, ale i tak jest to informacja operacyjna: ta kreacja jest drozsza w emisji.</w:t>
+      </w:r>
+    </w:p>
+    <w:p>
+      <w:pPr>
+        <w:spacing w:after="160"/>
+        <w:ind w:left="283"/>
+      </w:pPr>
+      <w:r>
+        <w:rPr>
+          <w:b/>
+          <w:color w:val="B86A00"/>
+          <w:sz w:val="20"/>
+        </w:rPr>
+        <w:t xml:space="preserve">– </w:t>
+      </w:r>
+      <w:r>
+        <w:rPr>
+          <w:color w:val="B86A00"/>
+          <w:sz w:val="20"/>
+        </w:rPr>
+        <w:t>Przy 22 zakupach dla plenerowego i 13 dla studyjnego mamy wystarczajaca skale, zeby ten wynik traktowac jako wiarygodny, nie przypadkowy. Poprzedni test (tura 1, 13 vs 13 zakupow) tego progu nie osiagal.</w:t>
+      </w:r>
+    </w:p>
+    <w:p/>
+    <w:p>
+      <w:pPr>
+        <w:spacing w:after="80" w:before="0"/>
       </w:pPr>
       <w:r>
         <w:rPr>
@@ -1079,7 +1162,7 @@
           <w:color w:val="5A6E64"/>
           <w:sz w:val="18"/>
         </w:rPr>
-        <w:t>Tatrzanski Park Narodowy  ·  Meta Ads  ·  Kampania: 20260728_O zwierzetach – test AB  ·  Sierpien 2026</w:t>
+        <w:t>Tatrzanski Park Narodowy  ·  Meta Ads  ·  Sierpien 2026</w:t>
       </w:r>
     </w:p>
     <w:sectPr>

</xml_diff>